<commit_message>
Correct response-letter line ranges to match tracked PDF (R1-3..R1-10, R2-1/4, R3-1/2/4)
</commit_message>
<xml_diff>
--- a/manuscript/Response_Letter.docx
+++ b/manuscript/Response_Letter.docx
@@ -905,7 +905,7 @@
           <w:bCs/>
           <w:b/>
         </w:rPr>
-        <w:t xml:space="preserve">Response (Revised manuscript, Lines 165-315).</w:t>
+        <w:t xml:space="preserve">Response (Revised manuscript, Lines 165-316).</w:t>
       </w:r>
     </w:p>
     <w:p>
@@ -992,7 +992,7 @@
           <w:bCs/>
           <w:b/>
         </w:rPr>
-        <w:t xml:space="preserve">Response (Revised manuscript, Lines 334-377).</w:t>
+        <w:t xml:space="preserve">Response (Revised manuscript, Lines 335-378).</w:t>
       </w:r>
     </w:p>
     <w:p>
@@ -1185,7 +1185,7 @@
           <w:bCs/>
           <w:b/>
         </w:rPr>
-        <w:t xml:space="preserve">Response (Revised manuscript, Lines 438-506).</w:t>
+        <w:t xml:space="preserve">Response (Revised manuscript, Lines 441-509).</w:t>
       </w:r>
     </w:p>
     <w:p>
@@ -1248,7 +1248,7 @@
           <w:bCs/>
           <w:b/>
         </w:rPr>
-        <w:t xml:space="preserve">Response (Revised manuscript, Lines 319-322, 531-598; Appendix D, Lines 1489-1491, Table A4).</w:t>
+        <w:t xml:space="preserve">Response (Revised manuscript, Lines 319-322, 534-601; Appendix D, Lines 1489-1491, Table A4).</w:t>
       </w:r>
     </w:p>
     <w:p>
@@ -1618,7 +1618,7 @@
           <w:bCs/>
           <w:b/>
         </w:rPr>
-        <w:t xml:space="preserve">Response (Revised manuscript, Lines 733-770, Algorithm 1).</w:t>
+        <w:t xml:space="preserve">Response (Revised manuscript, Lines 738-775, Algorithm 1).</w:t>
       </w:r>
     </w:p>
     <w:p>
@@ -1913,7 +1913,7 @@
           <w:bCs/>
           <w:b/>
         </w:rPr>
-        <w:t xml:space="preserve">Response (Revised manuscript, Lines 399–400, 602–603, 955–1015, 1122–1136, 1137–1238).</w:t>
+        <w:t xml:space="preserve">Response (Revised manuscript, Lines 399–400, 602–603, 955–1015, 1129–1143, 1144–1247).</w:t>
       </w:r>
     </w:p>
     <w:p>
@@ -1945,7 +1945,7 @@
         <w:pStyle w:val="BodyText"/>
       </w:pPr>
       <w:r>
-        <w:t xml:space="preserve">Style-deviation separability is reported in Section 4.7 (Lines 1122–1136, Fig. 5) on real features: the style-to-content energy ratio is 26 on PACS and 7 on OfficeHome, the domain signal is strong, and cross-domain class leakage stays near chance; the OfficeHome result is stated precisely as limited class-separated style deviation.</w:t>
+        <w:t xml:space="preserve">Style-deviation separability is reported in Section 4.7 (Lines 1129–1143, Fig. 5) on real features: the style-to-content energy ratio is 26 on PACS and 7 on OfficeHome, the domain signal is strong, and cross-domain class leakage stays near chance; the OfficeHome result is stated precisely as limited class-separated style deviation.</w:t>
       </w:r>
     </w:p>
     <w:p>
@@ -1953,7 +1953,7 @@
         <w:pStyle w:val="BodyText"/>
       </w:pPr>
       <w:r>
-        <w:t xml:space="preserve">Mechanism diagnostics are given in Section 4.8 (Lines 1137–1238, Fig. 6), including the gate-by-penalty comparison and the checkpoint-count, fallback, and gate-pressure analyses.</w:t>
+        <w:t xml:space="preserve">Mechanism diagnostics are given in Section 4.8 (Lines 1144–1247, Fig. 6), including the gate-by-penalty comparison and the checkpoint-count, fallback, and gate-pressure analyses.</w:t>
       </w:r>
     </w:p>
     <w:p>
@@ -2005,7 +2005,7 @@
           <w:bCs/>
           <w:b/>
         </w:rPr>
-        <w:t xml:space="preserve">Response (Revised manuscript, Lines 802–1211, 1473–1502).</w:t>
+        <w:t xml:space="preserve">Response (Revised manuscript, Lines 802–1212, 1473–1502).</w:t>
       </w:r>
     </w:p>
     <w:p>
@@ -2127,7 +2127,7 @@
           <w:bCs/>
           <w:b/>
         </w:rPr>
-        <w:t xml:space="preserve">Response (Revised manuscript, Lines 1239–1382, 1383–1433).</w:t>
+        <w:t xml:space="preserve">Response (Revised manuscript, Lines 1248–1377, 1394–1472).</w:t>
       </w:r>
     </w:p>
     <w:p>
@@ -2278,7 +2278,7 @@
           <w:bCs/>
           <w:b/>
         </w:rPr>
-        <w:t xml:space="preserve">Response (Revised manuscript, Lines 802–1211, 1473–1502).</w:t>
+        <w:t xml:space="preserve">Response (Revised manuscript, Lines 802–1212, 1473–1502).</w:t>
       </w:r>
     </w:p>
     <w:p>
@@ -2538,7 +2538,7 @@
           <w:bCs/>
           <w:b/>
         </w:rPr>
-        <w:t xml:space="preserve">Response (Revised manuscript, Lines 17–34, 37–155, 441–696, 1239–1318).</w:t>
+        <w:t xml:space="preserve">Response (Revised manuscript, Lines 17–34, 37–155, 441–696, 1248–1318).</w:t>
       </w:r>
     </w:p>
     <w:p>
@@ -3380,7 +3380,7 @@
           <w:bCs/>
           <w:b/>
         </w:rPr>
-        <w:t xml:space="preserve">Response (Revised manuscript, Lines 418–499).</w:t>
+        <w:t xml:space="preserve">Response (Revised manuscript, Lines 418–509).</w:t>
       </w:r>
     </w:p>
     <w:p>
@@ -3621,7 +3621,7 @@
           <w:bCs/>
           <w:b/>
         </w:rPr>
-        <w:t xml:space="preserve">Response (Revised manuscript, Lines 534–596).</w:t>
+        <w:t xml:space="preserve">Response (Revised manuscript, Lines 534–601).</w:t>
       </w:r>
     </w:p>
     <w:p>
@@ -4237,7 +4237,7 @@
           <w:bCs/>
           <w:b/>
         </w:rPr>
-        <w:t xml:space="preserve">Response (Revised manuscript, Lines 644–673).</w:t>
+        <w:t xml:space="preserve">Response (Revised manuscript, Lines 644–672).</w:t>
       </w:r>
     </w:p>
     <w:p>

</xml_diff>